<commit_message>
Update project files: app.py, index.html, docs, screenshots, models, and assets; add .gitignore
</commit_message>
<xml_diff>
--- a/AI_Driven_Process_Management_System_Documentation.docx
+++ b/AI_Driven_Process_Management_System_Documentation.docx
@@ -29,7 +29,33 @@
           <w:color w:val="000000"/>
           <w:sz w:val="36"/>
         </w:rPr>
-        <w:t>AI-DRIVEN PROCESS MANAGEMENT SYSTEM</w:t>
+        <w:t xml:space="preserve">AI-DRIVEN PROCESS </w:t>
+      </w:r>
+      <w:r>
+        <w:rPr>
+          <w:b/>
+          <w:bCs/>
+          <w:color w:val="000000"/>
+          <w:sz w:val="36"/>
+        </w:rPr>
+        <w:t>SCHEDULING</w:t>
+      </w:r>
+      <w:r>
+        <w:rPr>
+          <w:b/>
+          <w:bCs/>
+          <w:color w:val="000000"/>
+          <w:sz w:val="36"/>
+        </w:rPr>
+        <w:t xml:space="preserve"> </w:t>
+      </w:r>
+      <w:r>
+        <w:rPr>
+          <w:b/>
+          <w:color w:val="000000"/>
+          <w:sz w:val="36"/>
+        </w:rPr>
+        <w:t>SYSTEM</w:t>
       </w:r>
     </w:p>
     <w:p>
@@ -57,17 +83,7 @@
           <w:sz w:val="28"/>
           <w:lang w:val="en-IN"/>
         </w:rPr>
-        <w:t xml:space="preserve">OPERATING SYSTEMS </w:t>
-      </w:r>
-      <w:r>
-        <w:rPr>
-          <w:b/>
-          <w:bCs/>
-          <w:color w:val="000000"/>
-          <w:sz w:val="28"/>
-          <w:lang w:val="en-IN"/>
-        </w:rPr>
-        <w:t>(CS23501)</w:t>
+        <w:t>OPERATING SYSTEMS (CS23501)</w:t>
       </w:r>
     </w:p>
     <w:p>
@@ -701,7 +717,16 @@
           <w:sz w:val="28"/>
           <w:lang w:val="en-IN"/>
         </w:rPr>
-        <w:t>06</w:t>
+        <w:t>0</w:t>
+      </w:r>
+      <w:r>
+        <w:rPr>
+          <w:b/>
+          <w:color w:val="000000"/>
+          <w:sz w:val="28"/>
+          <w:lang w:val="en-IN"/>
+        </w:rPr>
+        <w:t>8</w:t>
       </w:r>
       <w:r>
         <w:rPr>
@@ -773,7 +798,53 @@
         <w:rPr>
           <w:color w:val="000000"/>
         </w:rPr>
-        <w:t>The AI-Driven Process Management System is an experimental web-based CPU scheduling platform that combines conventional scheduling algorithms with machine learning and reinforcement learning. The application provides a browser interface through which users can enter simulated process information and compare traditional scheduling behaviour with an AI-based scheduling workflow. The traditional side implements First-Come First-Serve (FCFS), Shortest Job First (SJF), and Round Robin in client-side JavaScript. The AI side sends process features to a Flask backend, where a Random Forest Regressor is used to predict burst time and a custom ProcessSchedulingEnv is used with a Proximal Policy Optimization (PPO) agent to choose between continuing the current process and switching processes.</w:t>
+        <w:t xml:space="preserve">The AI-Driven Process </w:t>
+      </w:r>
+      <w:r>
+        <w:rPr>
+          <w:color w:val="000000"/>
+        </w:rPr>
+        <w:t>Scheduling</w:t>
+      </w:r>
+      <w:r>
+        <w:rPr>
+          <w:b/>
+          <w:bCs/>
+          <w:color w:val="000000"/>
+        </w:rPr>
+        <w:t xml:space="preserve"> </w:t>
+      </w:r>
+      <w:r>
+        <w:rPr>
+          <w:color w:val="000000"/>
+        </w:rPr>
+        <w:t xml:space="preserve">System is an experimental web-based CPU scheduling platform that combines conventional scheduling algorithms with machine learning and reinforcement learning. The application provides a browser interface through which users can enter simulated process information and compare traditional scheduling </w:t>
+      </w:r>
+      <w:r>
+        <w:rPr>
+          <w:color w:val="000000"/>
+        </w:rPr>
+        <w:t>behaviors</w:t>
+      </w:r>
+      <w:r>
+        <w:rPr>
+          <w:color w:val="000000"/>
+        </w:rPr>
+        <w:t xml:space="preserve"> with an AI-based scheduling workflow. The traditional side implements First-Come First-Serve (FCFS), Shortest Job First (SJF), and Round Robin in client-side JavaScript. The AI side sends process features to a Flask backend, where a Random Forest Regressor is used to predict burst time and a custom </w:t>
+      </w:r>
+      <w:proofErr w:type="spellStart"/>
+      <w:r>
+        <w:rPr>
+          <w:color w:val="000000"/>
+        </w:rPr>
+        <w:t>ProcessSchedulingEnv</w:t>
+      </w:r>
+      <w:proofErr w:type="spellEnd"/>
+      <w:r>
+        <w:rPr>
+          <w:color w:val="000000"/>
+        </w:rPr>
+        <w:t xml:space="preserve"> is used with a Proximal Policy Optimization (PPO) agent to choose between continuing the current process and switching processes.</w:t>
       </w:r>
     </w:p>
     <w:p>
@@ -1232,30 +1303,6 @@
     </w:p>
     <w:p>
       <w:pPr>
-        <w:pStyle w:val="ListParagraph"/>
-        <w:numPr>
-          <w:ilvl w:val="0"/>
-          <w:numId w:val="14"/>
-        </w:numPr>
-        <w:spacing w:line="480" w:lineRule="auto"/>
-      </w:pPr>
-      <w:r>
-        <w:rPr>
-          <w:color w:val="000000"/>
-        </w:rPr>
-        <w:t>Appendix</w:t>
-      </w:r>
-    </w:p>
-    <w:p>
-      <w:r>
-        <w:rPr>
-          <w:color w:val="000000"/>
-        </w:rPr>
-        <w:br w:type="page"/>
-      </w:r>
-    </w:p>
-    <w:p>
-      <w:pPr>
         <w:pStyle w:val="Heading1"/>
       </w:pPr>
       <w:r>
@@ -1304,7 +1351,21 @@
         <w:rPr>
           <w:color w:val="000000"/>
         </w:rPr>
-        <w:t>Traditional scheduling policies are based on fixed rules and may behave differently as workload characteristics change. In particular, practical scheduling decisions may involve uncertain or predicted process behaviour. The project therefore explores a simulation in which process-related features are used to estimate burst time and an RL agent learns a scheduling action.</w:t>
+        <w:t xml:space="preserve">Traditional scheduling policies are based on fixed rules and may behave differently as workload characteristics change. In particular, practical scheduling decisions may involve uncertain or predicted process </w:t>
+      </w:r>
+      <w:proofErr w:type="spellStart"/>
+      <w:r>
+        <w:rPr>
+          <w:color w:val="000000"/>
+        </w:rPr>
+        <w:t>behaviour</w:t>
+      </w:r>
+      <w:proofErr w:type="spellEnd"/>
+      <w:r>
+        <w:rPr>
+          <w:color w:val="000000"/>
+        </w:rPr>
+        <w:t>. The project therefore explores a simulation in which process-related features are used to estimate burst time and an RL agent learns a scheduling action.</w:t>
       </w:r>
     </w:p>
     <w:p>
@@ -1631,7 +1692,21 @@
         <w:rPr>
           <w:color w:val="000000"/>
         </w:rPr>
-        <w:t>Fixed scheduling rules do not learn from workload characteristics. SJF requires burst-time information, which is not generally known exactly in advance in a real system. Round Robin behaviour depends on the chosen time quantum. These characteristics motivate the project's experimental AI-based approach.</w:t>
+        <w:t xml:space="preserve">Fixed scheduling rules do not learn from workload characteristics. SJF requires burst-time information, which is not generally known exactly in advance in a real system. Round Robin </w:t>
+      </w:r>
+      <w:proofErr w:type="spellStart"/>
+      <w:r>
+        <w:rPr>
+          <w:color w:val="000000"/>
+        </w:rPr>
+        <w:t>behaviour</w:t>
+      </w:r>
+      <w:proofErr w:type="spellEnd"/>
+      <w:r>
+        <w:rPr>
+          <w:color w:val="000000"/>
+        </w:rPr>
+        <w:t xml:space="preserve"> depends on the chosen time quantum. These characteristics motivate the project's experimental AI-based approach.</w:t>
       </w:r>
     </w:p>
     <w:p>
@@ -1767,7 +1842,21 @@
         <w:rPr>
           <w:color w:val="000000"/>
         </w:rPr>
-        <w:t>Custom ProcessSchedulingEnv for RL scheduling.</w:t>
+        <w:t xml:space="preserve">Custom </w:t>
+      </w:r>
+      <w:proofErr w:type="spellStart"/>
+      <w:r>
+        <w:rPr>
+          <w:color w:val="000000"/>
+        </w:rPr>
+        <w:t>ProcessSchedulingEnv</w:t>
+      </w:r>
+      <w:proofErr w:type="spellEnd"/>
+      <w:r>
+        <w:rPr>
+          <w:color w:val="000000"/>
+        </w:rPr>
+        <w:t xml:space="preserve"> for RL scheduling.</w:t>
       </w:r>
     </w:p>
     <w:p>
@@ -2955,12 +3044,14 @@
             <w:pPr>
               <w:spacing w:after="40"/>
             </w:pPr>
+            <w:proofErr w:type="spellStart"/>
             <w:r>
               <w:rPr>
                 <w:color w:val="000000"/>
               </w:rPr>
               <w:t>Joblib</w:t>
             </w:r>
+            <w:proofErr w:type="spellEnd"/>
           </w:p>
         </w:tc>
         <w:tc>
@@ -3451,12 +3542,14 @@
             <w:pPr>
               <w:spacing w:after="40"/>
             </w:pPr>
+            <w:proofErr w:type="spellStart"/>
             <w:r>
               <w:rPr>
                 <w:color w:val="000000"/>
               </w:rPr>
               <w:t>ProcessSchedulingEnv</w:t>
             </w:r>
+            <w:proofErr w:type="spellEnd"/>
           </w:p>
         </w:tc>
         <w:tc>
@@ -3952,7 +4045,49 @@
         <w:rPr>
           <w:color w:val="000000"/>
         </w:rPr>
-        <w:t>The burst-time prediction module loads process data, selects the model features, applies StandardScaler, trains or loads a RandomForestRegressor, and produces a burst-time estimate. The model and scaler are serialized using Joblib.</w:t>
+        <w:t xml:space="preserve">The burst-time prediction module loads process data, selects the model features, applies </w:t>
+      </w:r>
+      <w:proofErr w:type="spellStart"/>
+      <w:r>
+        <w:rPr>
+          <w:color w:val="000000"/>
+        </w:rPr>
+        <w:t>StandardScaler</w:t>
+      </w:r>
+      <w:proofErr w:type="spellEnd"/>
+      <w:r>
+        <w:rPr>
+          <w:color w:val="000000"/>
+        </w:rPr>
+        <w:t xml:space="preserve">, trains or loads a </w:t>
+      </w:r>
+      <w:proofErr w:type="spellStart"/>
+      <w:r>
+        <w:rPr>
+          <w:color w:val="000000"/>
+        </w:rPr>
+        <w:t>RandomForestRegressor</w:t>
+      </w:r>
+      <w:proofErr w:type="spellEnd"/>
+      <w:r>
+        <w:rPr>
+          <w:color w:val="000000"/>
+        </w:rPr>
+        <w:t xml:space="preserve">, and produces a burst-time estimate. The model and scaler are serialized using </w:t>
+      </w:r>
+      <w:proofErr w:type="spellStart"/>
+      <w:r>
+        <w:rPr>
+          <w:color w:val="000000"/>
+        </w:rPr>
+        <w:t>Joblib</w:t>
+      </w:r>
+      <w:proofErr w:type="spellEnd"/>
+      <w:r>
+        <w:rPr>
+          <w:color w:val="000000"/>
+        </w:rPr>
+        <w:t>.</w:t>
       </w:r>
     </w:p>
     <w:p>
@@ -3972,7 +4107,21 @@
         <w:rPr>
           <w:color w:val="000000"/>
         </w:rPr>
-        <w:t>The RL module defines ProcessSchedulingEnv and connects it with a PPO agent. The environment state includes predicted burst time, waiting time, queue length, and progress. The action space contains two discrete actions: continue the current process or switch to another process.</w:t>
+        <w:t xml:space="preserve">The RL module defines </w:t>
+      </w:r>
+      <w:proofErr w:type="spellStart"/>
+      <w:r>
+        <w:rPr>
+          <w:color w:val="000000"/>
+        </w:rPr>
+        <w:t>ProcessSchedulingEnv</w:t>
+      </w:r>
+      <w:proofErr w:type="spellEnd"/>
+      <w:r>
+        <w:rPr>
+          <w:color w:val="000000"/>
+        </w:rPr>
+        <w:t xml:space="preserve"> and connects it with a PPO agent. The environment state includes predicted burst time, waiting time, queue length, and progress. The action space contains two discrete actions: continue the current process or switch to another process.</w:t>
       </w:r>
     </w:p>
     <w:p>
@@ -4694,12 +4843,14 @@
             <w:pPr>
               <w:spacing w:after="40"/>
             </w:pPr>
+            <w:proofErr w:type="spellStart"/>
             <w:r>
               <w:rPr>
                 <w:color w:val="000000"/>
               </w:rPr>
               <w:t>learning_rate</w:t>
             </w:r>
+            <w:proofErr w:type="spellEnd"/>
           </w:p>
         </w:tc>
         <w:tc>
@@ -4733,12 +4884,14 @@
             <w:pPr>
               <w:spacing w:after="40"/>
             </w:pPr>
+            <w:proofErr w:type="spellStart"/>
             <w:r>
               <w:rPr>
                 <w:color w:val="000000"/>
               </w:rPr>
               <w:t>n_steps</w:t>
             </w:r>
+            <w:proofErr w:type="spellEnd"/>
           </w:p>
         </w:tc>
         <w:tc>
@@ -4772,12 +4925,14 @@
             <w:pPr>
               <w:spacing w:after="40"/>
             </w:pPr>
+            <w:proofErr w:type="spellStart"/>
             <w:r>
               <w:rPr>
                 <w:color w:val="000000"/>
               </w:rPr>
               <w:t>batch_size</w:t>
             </w:r>
+            <w:proofErr w:type="spellEnd"/>
           </w:p>
         </w:tc>
         <w:tc>
@@ -4811,12 +4966,14 @@
             <w:pPr>
               <w:spacing w:after="40"/>
             </w:pPr>
+            <w:proofErr w:type="spellStart"/>
             <w:r>
               <w:rPr>
                 <w:color w:val="000000"/>
               </w:rPr>
               <w:t>n_epochs</w:t>
             </w:r>
+            <w:proofErr w:type="spellEnd"/>
           </w:p>
         </w:tc>
         <w:tc>
@@ -5171,12 +5328,22 @@
       </w:r>
     </w:p>
     <w:p>
+      <w:pPr>
+        <w:rPr>
+          <w:color w:val="000000"/>
+        </w:rPr>
+      </w:pPr>
       <w:r>
         <w:rPr>
           <w:color w:val="000000"/>
         </w:rPr>
         <w:t>There is no persistent user/session database for storing historical scheduling experiments. A future SQLite or PostgreSQL layer could be added if persistent experiment tracking is required.</w:t>
       </w:r>
+    </w:p>
+    <w:p>
+      <w:pPr>
+        <w:jc w:val="center"/>
+      </w:pPr>
     </w:p>
     <w:p>
       <w:pPr>
@@ -5538,6 +5705,11 @@
       </w:r>
     </w:p>
     <w:p>
+      <w:pPr>
+        <w:rPr>
+          <w:color w:val="000000"/>
+        </w:rPr>
+      </w:pPr>
       <w:r>
         <w:rPr>
           <w:color w:val="000000"/>
@@ -5545,6 +5717,108 @@
         <w:t>The interface uses HTML, CSS, JavaScript, and Bootstrap-based layout. It presents two primary areas: a Basic Scheduler and an AI-Powered Scheduler.</w:t>
       </w:r>
     </w:p>
+    <w:p>
+      <w:pPr>
+        <w:rPr>
+          <w:color w:val="000000"/>
+        </w:rPr>
+      </w:pPr>
+    </w:p>
+    <w:p>
+      <w:pPr>
+        <w:rPr>
+          <w:color w:val="000000"/>
+        </w:rPr>
+      </w:pPr>
+    </w:p>
+    <w:p>
+      <w:pPr>
+        <w:rPr>
+          <w:color w:val="000000"/>
+        </w:rPr>
+      </w:pPr>
+    </w:p>
+    <w:p>
+      <w:pPr>
+        <w:rPr>
+          <w:color w:val="000000"/>
+        </w:rPr>
+      </w:pPr>
+    </w:p>
+    <w:p>
+      <w:pPr>
+        <w:rPr>
+          <w:color w:val="000000"/>
+        </w:rPr>
+      </w:pPr>
+    </w:p>
+    <w:p>
+      <w:pPr>
+        <w:rPr>
+          <w:color w:val="000000"/>
+        </w:rPr>
+      </w:pPr>
+    </w:p>
+    <w:p>
+      <w:pPr>
+        <w:rPr>
+          <w:color w:val="000000"/>
+        </w:rPr>
+      </w:pPr>
+    </w:p>
+    <w:p>
+      <w:pPr>
+        <w:rPr>
+          <w:color w:val="000000"/>
+        </w:rPr>
+      </w:pPr>
+    </w:p>
+    <w:p>
+      <w:pPr>
+        <w:rPr>
+          <w:color w:val="000000"/>
+        </w:rPr>
+      </w:pPr>
+    </w:p>
+    <w:p>
+      <w:pPr>
+        <w:rPr>
+          <w:color w:val="000000"/>
+        </w:rPr>
+      </w:pPr>
+    </w:p>
+    <w:p>
+      <w:pPr>
+        <w:rPr>
+          <w:color w:val="000000"/>
+        </w:rPr>
+      </w:pPr>
+    </w:p>
+    <w:p>
+      <w:pPr>
+        <w:rPr>
+          <w:color w:val="000000"/>
+        </w:rPr>
+      </w:pPr>
+    </w:p>
+    <w:p>
+      <w:pPr>
+        <w:pStyle w:val="Heading2"/>
+        <w:rPr>
+          <w:rFonts w:ascii="Times New Roman" w:eastAsia="Times New Roman" w:hAnsi="Times New Roman"/>
+          <w:sz w:val="24"/>
+        </w:rPr>
+      </w:pPr>
+      <w:r>
+        <w:rPr>
+          <w:rFonts w:ascii="Times New Roman" w:eastAsia="Times New Roman" w:hAnsi="Times New Roman"/>
+          <w:sz w:val="24"/>
+        </w:rPr>
+        <w:lastRenderedPageBreak/>
+        <w:t>12.1 Basic Scheduler Output</w:t>
+      </w:r>
+    </w:p>
+    <w:p/>
     <w:p>
       <w:pPr>
         <w:spacing w:before="80" w:after="60"/>
@@ -5555,9 +5829,8 @@
           <w:noProof/>
           <w:color w:val="000000"/>
         </w:rPr>
-        <w:lastRenderedPageBreak/>
         <w:drawing>
-          <wp:inline distT="0" distB="0" distL="0" distR="0" wp14:anchorId="6DEC268D" wp14:editId="178FE0E4">
+          <wp:inline distT="0" distB="0" distL="0" distR="0" wp14:anchorId="6DEC268D" wp14:editId="27BDB315">
             <wp:extent cx="5669280" cy="3727065"/>
             <wp:effectExtent l="0" t="0" r="0" b="0"/>
             <wp:docPr id="7" name="Picture 7"/>
@@ -5783,24 +6056,6 @@
     </w:p>
     <w:p>
       <w:pPr>
-        <w:pStyle w:val="Heading2"/>
-        <w:rPr>
-          <w:rFonts w:ascii="Times New Roman" w:eastAsia="Times New Roman" w:hAnsi="Times New Roman"/>
-          <w:sz w:val="24"/>
-        </w:rPr>
-      </w:pPr>
-      <w:r>
-        <w:rPr>
-          <w:rFonts w:ascii="Times New Roman" w:eastAsia="Times New Roman" w:hAnsi="Times New Roman"/>
-          <w:sz w:val="24"/>
-        </w:rPr>
-        <w:t>12.1 Basic Scheduler Output</w:t>
-      </w:r>
-    </w:p>
-    <w:p/>
-    <w:p>
-      <w:pPr>
-        <w:spacing w:before="80" w:after="60"/>
         <w:jc w:val="center"/>
       </w:pPr>
       <w:r>
@@ -5809,10 +6064,10 @@
           <w:color w:val="000000"/>
         </w:rPr>
         <w:drawing>
-          <wp:inline distT="0" distB="0" distL="0" distR="0" wp14:anchorId="05B35370" wp14:editId="4B94A38A">
-            <wp:extent cx="5669280" cy="5231623"/>
+          <wp:inline distT="0" distB="0" distL="0" distR="0" wp14:anchorId="62916B46" wp14:editId="4440AD2D">
+            <wp:extent cx="5583555" cy="7223760"/>
             <wp:effectExtent l="0" t="0" r="0" b="0"/>
-            <wp:docPr id="8" name="Picture 8"/>
+            <wp:docPr id="2089604131" name="Picture 1"/>
             <wp:cNvGraphicFramePr>
               <a:graphicFrameLocks xmlns:a="http://schemas.openxmlformats.org/drawingml/2006/main" noChangeAspect="1"/>
             </wp:cNvGraphicFramePr>
@@ -5820,7 +6075,7 @@
               <a:graphicData uri="http://schemas.openxmlformats.org/drawingml/2006/picture">
                 <pic:pic xmlns:pic="http://schemas.openxmlformats.org/drawingml/2006/picture">
                   <pic:nvPicPr>
-                    <pic:cNvPr id="0" name="gray_image5.png"/>
+                    <pic:cNvPr id="2089604131" name=""/>
                     <pic:cNvPicPr/>
                   </pic:nvPicPr>
                   <pic:blipFill>
@@ -5832,7 +6087,7 @@
                   <pic:spPr>
                     <a:xfrm>
                       <a:off x="0" y="0"/>
-                      <a:ext cx="5669280" cy="5231623"/>
+                      <a:ext cx="5606964" cy="7254046"/>
                     </a:xfrm>
                     <a:prstGeom prst="rect">
                       <a:avLst/>
@@ -5847,6 +6102,12 @@
     </w:p>
     <w:p>
       <w:pPr>
+        <w:spacing w:before="80" w:after="60"/>
+        <w:jc w:val="center"/>
+      </w:pPr>
+    </w:p>
+    <w:p>
+      <w:pPr>
         <w:spacing w:after="160"/>
         <w:jc w:val="center"/>
         <w:rPr>
@@ -5868,14 +6129,192 @@
       <w:pPr>
         <w:spacing w:after="160"/>
         <w:jc w:val="center"/>
-      </w:pPr>
-    </w:p>
-    <w:p>
-      <w:r>
-        <w:rPr>
-          <w:color w:val="000000"/>
-        </w:rPr>
-        <w:t>The supplied execution screenshot demonstrates the two-panel interface and shows schedule/metric output. The AI panel in the captured run displays CPU utilization as 'NaN%'. This is an observed output of the supplied screenshot and should be treated as a calculation/edge-case issue rather than as a valid measured CPU-utilization result.</w:t>
+        <w:rPr>
+          <w:b/>
+          <w:color w:val="000000"/>
+          <w:sz w:val="20"/>
+        </w:rPr>
+      </w:pPr>
+    </w:p>
+    <w:p>
+      <w:pPr>
+        <w:spacing w:after="160"/>
+        <w:jc w:val="center"/>
+        <w:rPr>
+          <w:b/>
+          <w:color w:val="000000"/>
+          <w:sz w:val="20"/>
+        </w:rPr>
+      </w:pPr>
+      <w:r>
+        <w:rPr>
+          <w:b/>
+          <w:noProof/>
+          <w:color w:val="000000"/>
+          <w:sz w:val="20"/>
+        </w:rPr>
+        <w:lastRenderedPageBreak/>
+        <w:drawing>
+          <wp:inline distT="0" distB="0" distL="0" distR="0" wp14:anchorId="10640355" wp14:editId="4E66AA62">
+            <wp:extent cx="6750685" cy="3649345"/>
+            <wp:effectExtent l="0" t="0" r="0" b="8255"/>
+            <wp:docPr id="1124508691" name="Picture 1"/>
+            <wp:cNvGraphicFramePr>
+              <a:graphicFrameLocks xmlns:a="http://schemas.openxmlformats.org/drawingml/2006/main" noChangeAspect="1"/>
+            </wp:cNvGraphicFramePr>
+            <a:graphic xmlns:a="http://schemas.openxmlformats.org/drawingml/2006/main">
+              <a:graphicData uri="http://schemas.openxmlformats.org/drawingml/2006/picture">
+                <pic:pic xmlns:pic="http://schemas.openxmlformats.org/drawingml/2006/picture">
+                  <pic:nvPicPr>
+                    <pic:cNvPr id="1124508691" name=""/>
+                    <pic:cNvPicPr/>
+                  </pic:nvPicPr>
+                  <pic:blipFill>
+                    <a:blip r:embed="rId16"/>
+                    <a:stretch>
+                      <a:fillRect/>
+                    </a:stretch>
+                  </pic:blipFill>
+                  <pic:spPr>
+                    <a:xfrm>
+                      <a:off x="0" y="0"/>
+                      <a:ext cx="6750685" cy="3649345"/>
+                    </a:xfrm>
+                    <a:prstGeom prst="rect">
+                      <a:avLst/>
+                    </a:prstGeom>
+                  </pic:spPr>
+                </pic:pic>
+              </a:graphicData>
+            </a:graphic>
+          </wp:inline>
+        </w:drawing>
+      </w:r>
+    </w:p>
+    <w:p>
+      <w:pPr>
+        <w:spacing w:after="160"/>
+        <w:jc w:val="center"/>
+        <w:rPr>
+          <w:b/>
+          <w:color w:val="000000"/>
+          <w:sz w:val="20"/>
+        </w:rPr>
+      </w:pPr>
+      <w:r>
+        <w:rPr>
+          <w:b/>
+          <w:color w:val="000000"/>
+          <w:sz w:val="20"/>
+        </w:rPr>
+        <w:t>Figure 12.3</w:t>
+      </w:r>
+    </w:p>
+    <w:p>
+      <w:pPr>
+        <w:spacing w:after="160"/>
+        <w:jc w:val="center"/>
+        <w:rPr>
+          <w:b/>
+          <w:color w:val="000000"/>
+          <w:sz w:val="20"/>
+        </w:rPr>
+      </w:pPr>
+    </w:p>
+    <w:p>
+      <w:pPr>
+        <w:spacing w:after="160"/>
+        <w:jc w:val="center"/>
+        <w:rPr>
+          <w:b/>
+          <w:color w:val="000000"/>
+          <w:sz w:val="20"/>
+        </w:rPr>
+      </w:pPr>
+      <w:r>
+        <w:rPr>
+          <w:b/>
+          <w:noProof/>
+          <w:color w:val="000000"/>
+          <w:sz w:val="20"/>
+        </w:rPr>
+        <w:drawing>
+          <wp:inline distT="0" distB="0" distL="0" distR="0" wp14:anchorId="585D6A09" wp14:editId="5E415B22">
+            <wp:extent cx="6750685" cy="3868420"/>
+            <wp:effectExtent l="0" t="0" r="0" b="0"/>
+            <wp:docPr id="1230013937" name="Picture 1"/>
+            <wp:cNvGraphicFramePr>
+              <a:graphicFrameLocks xmlns:a="http://schemas.openxmlformats.org/drawingml/2006/main" noChangeAspect="1"/>
+            </wp:cNvGraphicFramePr>
+            <a:graphic xmlns:a="http://schemas.openxmlformats.org/drawingml/2006/main">
+              <a:graphicData uri="http://schemas.openxmlformats.org/drawingml/2006/picture">
+                <pic:pic xmlns:pic="http://schemas.openxmlformats.org/drawingml/2006/picture">
+                  <pic:nvPicPr>
+                    <pic:cNvPr id="1230013937" name=""/>
+                    <pic:cNvPicPr/>
+                  </pic:nvPicPr>
+                  <pic:blipFill>
+                    <a:blip r:embed="rId17"/>
+                    <a:stretch>
+                      <a:fillRect/>
+                    </a:stretch>
+                  </pic:blipFill>
+                  <pic:spPr>
+                    <a:xfrm>
+                      <a:off x="0" y="0"/>
+                      <a:ext cx="6750685" cy="3868420"/>
+                    </a:xfrm>
+                    <a:prstGeom prst="rect">
+                      <a:avLst/>
+                    </a:prstGeom>
+                  </pic:spPr>
+                </pic:pic>
+              </a:graphicData>
+            </a:graphic>
+          </wp:inline>
+        </w:drawing>
+      </w:r>
+    </w:p>
+    <w:p>
+      <w:pPr>
+        <w:spacing w:after="160"/>
+        <w:jc w:val="center"/>
+        <w:rPr>
+          <w:b/>
+          <w:color w:val="000000"/>
+          <w:sz w:val="20"/>
+        </w:rPr>
+      </w:pPr>
+      <w:r>
+        <w:rPr>
+          <w:b/>
+          <w:color w:val="000000"/>
+          <w:sz w:val="20"/>
+        </w:rPr>
+        <w:t>Figure 12.4</w:t>
+      </w:r>
+    </w:p>
+    <w:p>
+      <w:r>
+        <w:rPr>
+          <w:color w:val="000000"/>
+        </w:rPr>
+        <w:lastRenderedPageBreak/>
+        <w:t>The supplied execution screenshot demonstrates the two-panel interface and shows schedule/metric output. The AI panel in the captured run displays CPU utilization as '</w:t>
+      </w:r>
+      <w:proofErr w:type="spellStart"/>
+      <w:r>
+        <w:rPr>
+          <w:color w:val="000000"/>
+        </w:rPr>
+        <w:t>NaN</w:t>
+      </w:r>
+      <w:proofErr w:type="spellEnd"/>
+      <w:r>
+        <w:rPr>
+          <w:color w:val="000000"/>
+        </w:rPr>
+        <w:t>%'. This is an observed output of the supplied screenshot and should be treated as a calculation/edge-case issue rather than as a valid measured CPU-utilization result.</w:t>
       </w:r>
     </w:p>
     <w:p>
@@ -5917,7 +6356,6 @@
           <w:b/>
           <w:color w:val="000000"/>
         </w:rPr>
-        <w:lastRenderedPageBreak/>
         <w:t xml:space="preserve">• </w:t>
       </w:r>
       <w:r>
@@ -6098,6 +6536,7 @@
           <w:rFonts w:ascii="Times New Roman" w:eastAsia="Times New Roman" w:hAnsi="Times New Roman"/>
           <w:sz w:val="24"/>
         </w:rPr>
+        <w:lastRenderedPageBreak/>
         <w:t>14.2 Input Validation Considerations</w:t>
       </w:r>
     </w:p>
@@ -6200,7 +6639,6 @@
           <w:rFonts w:ascii="Times New Roman" w:eastAsia="Times New Roman" w:hAnsi="Times New Roman"/>
           <w:sz w:val="24"/>
         </w:rPr>
-        <w:lastRenderedPageBreak/>
         <w:t>14.3 Scope of Security Claims</w:t>
       </w:r>
     </w:p>
@@ -6892,7 +7330,21 @@
         <w:rPr>
           <w:color w:val="000000"/>
         </w:rPr>
-        <w:t>The supplied screenshot of the AI scheduler shows CPU utilization as NaN%. This should be corrected in the implementation or explicitly recorded as a known test defect. It should not be used as evidence of successful CPU-utilization measurement.</w:t>
+        <w:t xml:space="preserve">The supplied screenshot of the AI scheduler shows CPU utilization as </w:t>
+      </w:r>
+      <w:proofErr w:type="spellStart"/>
+      <w:r>
+        <w:rPr>
+          <w:color w:val="000000"/>
+        </w:rPr>
+        <w:t>NaN</w:t>
+      </w:r>
+      <w:proofErr w:type="spellEnd"/>
+      <w:r>
+        <w:rPr>
+          <w:color w:val="000000"/>
+        </w:rPr>
+        <w:t>%. This should be corrected in the implementation or explicitly recorded as a known test defect. It should not be used as evidence of successful CPU-utilization measurement.</w:t>
       </w:r>
     </w:p>
     <w:p>
@@ -6904,6 +7356,7 @@
           <w:rFonts w:ascii="Times New Roman" w:eastAsia="Times New Roman" w:hAnsi="Times New Roman"/>
           <w:sz w:val="24"/>
         </w:rPr>
+        <w:lastRenderedPageBreak/>
         <w:t>16. DEPLOYMENT</w:t>
       </w:r>
     </w:p>
@@ -7000,6 +7453,314 @@
           <w:b/>
           <w:color w:val="000000"/>
         </w:rPr>
+        <w:t xml:space="preserve">5. </w:t>
+      </w:r>
+      <w:r>
+        <w:rPr>
+          <w:color w:val="000000"/>
+        </w:rPr>
+        <w:t>Open the local Flask address in a modern web browser.</w:t>
+      </w:r>
+    </w:p>
+    <w:p>
+      <w:pPr>
+        <w:pStyle w:val="Heading2"/>
+      </w:pPr>
+      <w:r>
+        <w:rPr>
+          <w:rFonts w:ascii="Times New Roman" w:eastAsia="Times New Roman" w:hAnsi="Times New Roman"/>
+          <w:sz w:val="24"/>
+        </w:rPr>
+        <w:t>16.2 Example Local Execution</w:t>
+      </w:r>
+    </w:p>
+    <w:p>
+      <w:r>
+        <w:rPr>
+          <w:color w:val="000000"/>
+        </w:rPr>
+        <w:t>The supplied project documentation uses `python app.py` and a local Flask address. The exact dependency versions should be taken from the repository's requirements file when reproducing the project; they should not be replaced with inferred versions.</w:t>
+      </w:r>
+    </w:p>
+    <w:p>
+      <w:pPr>
+        <w:pStyle w:val="Heading2"/>
+      </w:pPr>
+      <w:r>
+        <w:rPr>
+          <w:rFonts w:ascii="Times New Roman" w:eastAsia="Times New Roman" w:hAnsi="Times New Roman"/>
+          <w:sz w:val="24"/>
+        </w:rPr>
+        <w:t>16.3 Deployment Scope</w:t>
+      </w:r>
+    </w:p>
+    <w:p>
+      <w:r>
+        <w:rPr>
+          <w:color w:val="000000"/>
+        </w:rPr>
+        <w:t>The current architecture is suitable for local demonstration and experimentation. Production deployment would require hardened configuration, input validation, monitoring, controlled model loading, and appropriate web-server deployment practices.</w:t>
+      </w:r>
+    </w:p>
+    <w:p>
+      <w:pPr>
+        <w:pStyle w:val="Heading1"/>
+      </w:pPr>
+      <w:r>
+        <w:rPr>
+          <w:rFonts w:ascii="Times New Roman" w:eastAsia="Times New Roman" w:hAnsi="Times New Roman"/>
+          <w:sz w:val="24"/>
+        </w:rPr>
+        <w:t>17. LIMITATIONS</w:t>
+      </w:r>
+    </w:p>
+    <w:p>
+      <w:pPr>
+        <w:ind w:left="360" w:hanging="259"/>
+      </w:pPr>
+      <w:r>
+        <w:rPr>
+          <w:b/>
+          <w:color w:val="000000"/>
+        </w:rPr>
+        <w:t xml:space="preserve">• </w:t>
+      </w:r>
+      <w:r>
+        <w:rPr>
+          <w:color w:val="000000"/>
+        </w:rPr>
+        <w:t>The project is a CPU-scheduling simulation rather than a kernel-level operating-system scheduler.</w:t>
+      </w:r>
+    </w:p>
+    <w:p>
+      <w:pPr>
+        <w:ind w:left="360" w:hanging="259"/>
+      </w:pPr>
+      <w:r>
+        <w:rPr>
+          <w:b/>
+          <w:color w:val="000000"/>
+        </w:rPr>
+        <w:t xml:space="preserve">• </w:t>
+      </w:r>
+      <w:r>
+        <w:rPr>
+          <w:color w:val="000000"/>
+        </w:rPr>
+        <w:t>The basic schedulers execute client-side while the AI scheduler uses the Flask backend, so the two paths are architecturally different.</w:t>
+      </w:r>
+    </w:p>
+    <w:p>
+      <w:pPr>
+        <w:ind w:left="360" w:hanging="259"/>
+      </w:pPr>
+      <w:r>
+        <w:rPr>
+          <w:b/>
+          <w:color w:val="000000"/>
+        </w:rPr>
+        <w:t xml:space="preserve">• </w:t>
+      </w:r>
+      <w:r>
+        <w:rPr>
+          <w:color w:val="000000"/>
+        </w:rPr>
+        <w:t>The ML model depends on the available dataset and therefore requires independent validation before claims of generalization.</w:t>
+      </w:r>
+    </w:p>
+    <w:p>
+      <w:pPr>
+        <w:ind w:left="360" w:hanging="259"/>
+      </w:pPr>
+      <w:r>
+        <w:rPr>
+          <w:b/>
+          <w:color w:val="000000"/>
+        </w:rPr>
+        <w:t xml:space="preserve">• </w:t>
+      </w:r>
+      <w:r>
+        <w:rPr>
+          <w:color w:val="000000"/>
+        </w:rPr>
+        <w:t>The current storage approach does not provide persistent experiment history.</w:t>
+      </w:r>
+    </w:p>
+    <w:p>
+      <w:pPr>
+        <w:ind w:left="360" w:hanging="259"/>
+      </w:pPr>
+      <w:r>
+        <w:rPr>
+          <w:b/>
+          <w:color w:val="000000"/>
+        </w:rPr>
+        <w:t xml:space="preserve">• </w:t>
+      </w:r>
+      <w:r>
+        <w:rPr>
+          <w:color w:val="000000"/>
+        </w:rPr>
+        <w:t xml:space="preserve">The displayed AI screenshot contains a </w:t>
+      </w:r>
+      <w:proofErr w:type="spellStart"/>
+      <w:r>
+        <w:rPr>
+          <w:color w:val="000000"/>
+        </w:rPr>
+        <w:t>NaN</w:t>
+      </w:r>
+      <w:proofErr w:type="spellEnd"/>
+      <w:r>
+        <w:rPr>
+          <w:color w:val="000000"/>
+        </w:rPr>
+        <w:t xml:space="preserve"> CPU-utilization result, indicating an edge case that requires correction.</w:t>
+      </w:r>
+    </w:p>
+    <w:p>
+      <w:pPr>
+        <w:ind w:left="360" w:hanging="259"/>
+      </w:pPr>
+      <w:r>
+        <w:rPr>
+          <w:b/>
+          <w:color w:val="000000"/>
+        </w:rPr>
+        <w:t xml:space="preserve">• </w:t>
+      </w:r>
+      <w:r>
+        <w:rPr>
+          <w:color w:val="000000"/>
+        </w:rPr>
+        <w:t>Arrival-time and workload realism should be evaluated further before treating the RL results as representative of real operating-system workloads.</w:t>
+      </w:r>
+    </w:p>
+    <w:p>
+      <w:pPr>
+        <w:ind w:left="360" w:hanging="259"/>
+      </w:pPr>
+      <w:r>
+        <w:rPr>
+          <w:b/>
+          <w:color w:val="000000"/>
+        </w:rPr>
+        <w:t xml:space="preserve">• </w:t>
+      </w:r>
+      <w:r>
+        <w:rPr>
+          <w:color w:val="000000"/>
+        </w:rPr>
+        <w:t>Performance comparisons should be based on repeated controlled experiments rather than a single screenshot.</w:t>
+      </w:r>
+    </w:p>
+    <w:p>
+      <w:pPr>
+        <w:pStyle w:val="Heading1"/>
+      </w:pPr>
+      <w:r>
+        <w:rPr>
+          <w:rFonts w:ascii="Times New Roman" w:eastAsia="Times New Roman" w:hAnsi="Times New Roman"/>
+          <w:sz w:val="24"/>
+        </w:rPr>
+        <w:t>18. FUTURE ENHANCEMENTS</w:t>
+      </w:r>
+    </w:p>
+    <w:p>
+      <w:pPr>
+        <w:ind w:left="403" w:hanging="288"/>
+      </w:pPr>
+      <w:r>
+        <w:rPr>
+          <w:b/>
+          <w:color w:val="000000"/>
+        </w:rPr>
+        <w:t xml:space="preserve">1. </w:t>
+      </w:r>
+      <w:r>
+        <w:rPr>
+          <w:color w:val="000000"/>
+        </w:rPr>
+        <w:t>Add persistent experiment storage using SQLite or PostgreSQL.</w:t>
+      </w:r>
+    </w:p>
+    <w:p>
+      <w:pPr>
+        <w:ind w:left="403" w:hanging="288"/>
+      </w:pPr>
+      <w:r>
+        <w:rPr>
+          <w:b/>
+          <w:color w:val="000000"/>
+        </w:rPr>
+        <w:t xml:space="preserve">2. </w:t>
+      </w:r>
+      <w:r>
+        <w:rPr>
+          <w:color w:val="000000"/>
+        </w:rPr>
+        <w:t>Improve validation for arrival times, feature ranges, and process counts.</w:t>
+      </w:r>
+    </w:p>
+    <w:p>
+      <w:pPr>
+        <w:ind w:left="403" w:hanging="288"/>
+      </w:pPr>
+      <w:r>
+        <w:rPr>
+          <w:b/>
+          <w:color w:val="000000"/>
+        </w:rPr>
+        <w:t xml:space="preserve">3. </w:t>
+      </w:r>
+      <w:r>
+        <w:rPr>
+          <w:color w:val="000000"/>
+        </w:rPr>
+        <w:t xml:space="preserve">Investigate and correct the CPU-utilization </w:t>
+      </w:r>
+      <w:proofErr w:type="spellStart"/>
+      <w:r>
+        <w:rPr>
+          <w:color w:val="000000"/>
+        </w:rPr>
+        <w:t>NaN</w:t>
+      </w:r>
+      <w:proofErr w:type="spellEnd"/>
+      <w:r>
+        <w:rPr>
+          <w:color w:val="000000"/>
+        </w:rPr>
+        <w:t xml:space="preserve"> edge case.</w:t>
+      </w:r>
+    </w:p>
+    <w:p>
+      <w:pPr>
+        <w:ind w:left="403" w:hanging="288"/>
+      </w:pPr>
+      <w:r>
+        <w:rPr>
+          <w:b/>
+          <w:color w:val="000000"/>
+        </w:rPr>
+        <w:t xml:space="preserve">4. </w:t>
+      </w:r>
+      <w:r>
+        <w:rPr>
+          <w:color w:val="000000"/>
+        </w:rPr>
+        <w:t>Add repeatable benchmark workloads and confidence/variance reporting.</w:t>
+      </w:r>
+    </w:p>
+    <w:p>
+      <w:pPr>
+        <w:ind w:left="403" w:hanging="288"/>
+      </w:pPr>
+      <w:r>
+        <w:rPr>
+          <w:b/>
+          <w:color w:val="000000"/>
+        </w:rPr>
         <w:lastRenderedPageBreak/>
         <w:t xml:space="preserve">5. </w:t>
       </w:r>
@@ -7007,59 +7768,161 @@
         <w:rPr>
           <w:color w:val="000000"/>
         </w:rPr>
-        <w:t>Open the local Flask address in a modern web browser.</w:t>
-      </w:r>
-    </w:p>
-    <w:p>
-      <w:pPr>
-        <w:pStyle w:val="Heading2"/>
+        <w:t>Evaluate the ML model using independent validation/test traces.</w:t>
+      </w:r>
+    </w:p>
+    <w:p>
+      <w:pPr>
+        <w:ind w:left="403" w:hanging="288"/>
+      </w:pPr>
+      <w:r>
+        <w:rPr>
+          <w:b/>
+          <w:color w:val="000000"/>
+        </w:rPr>
+        <w:t xml:space="preserve">6. </w:t>
+      </w:r>
+      <w:r>
+        <w:rPr>
+          <w:color w:val="000000"/>
+        </w:rPr>
+        <w:t>Train and evaluate the RL scheduler with broader workload distributions and real process traces where appropriate.</w:t>
+      </w:r>
+    </w:p>
+    <w:p>
+      <w:pPr>
+        <w:ind w:left="403" w:hanging="288"/>
+      </w:pPr>
+      <w:r>
+        <w:rPr>
+          <w:b/>
+          <w:color w:val="000000"/>
+        </w:rPr>
+        <w:t xml:space="preserve">7. </w:t>
+      </w:r>
+      <w:r>
+        <w:rPr>
+          <w:color w:val="000000"/>
+        </w:rPr>
+        <w:t>Extend the simulator to multi-core CPU scheduling.</w:t>
+      </w:r>
+    </w:p>
+    <w:p>
+      <w:pPr>
+        <w:ind w:left="403" w:hanging="288"/>
+      </w:pPr>
+      <w:r>
+        <w:rPr>
+          <w:b/>
+          <w:color w:val="000000"/>
+        </w:rPr>
+        <w:t xml:space="preserve">8. </w:t>
+      </w:r>
+      <w:r>
+        <w:rPr>
+          <w:color w:val="000000"/>
+        </w:rPr>
+        <w:t>Add automated unit and integration tests.</w:t>
+      </w:r>
+    </w:p>
+    <w:p>
+      <w:pPr>
+        <w:ind w:left="403" w:hanging="288"/>
+      </w:pPr>
+      <w:r>
+        <w:rPr>
+          <w:b/>
+          <w:color w:val="000000"/>
+        </w:rPr>
+        <w:t xml:space="preserve">9. </w:t>
+      </w:r>
+      <w:r>
+        <w:rPr>
+          <w:color w:val="000000"/>
+        </w:rPr>
+        <w:t>Improve production deployment and security boundaries.</w:t>
+      </w:r>
+    </w:p>
+    <w:p>
+      <w:pPr>
+        <w:pStyle w:val="Heading1"/>
       </w:pPr>
       <w:r>
         <w:rPr>
           <w:rFonts w:ascii="Times New Roman" w:eastAsia="Times New Roman" w:hAnsi="Times New Roman"/>
           <w:sz w:val="24"/>
         </w:rPr>
-        <w:t>16.2 Example Local Execution</w:t>
-      </w:r>
-    </w:p>
-    <w:p>
-      <w:r>
-        <w:rPr>
-          <w:color w:val="000000"/>
-        </w:rPr>
-        <w:t>The supplied project documentation uses `python app.py` and a local Flask address. The exact dependency versions should be taken from the repository's requirements file when reproducing the project; they should not be replaced with inferred versions.</w:t>
-      </w:r>
-    </w:p>
-    <w:p>
-      <w:pPr>
-        <w:pStyle w:val="Heading2"/>
+        <w:t>19. CONCLUSION</w:t>
+      </w:r>
+    </w:p>
+    <w:p>
+      <w:r>
+        <w:rPr>
+          <w:color w:val="000000"/>
+        </w:rPr>
+        <w:t xml:space="preserve">The AI-Driven Process </w:t>
+      </w:r>
+      <w:r>
+        <w:rPr>
+          <w:color w:val="000000"/>
+        </w:rPr>
+        <w:t>Scheduling</w:t>
+      </w:r>
+      <w:r>
+        <w:rPr>
+          <w:b/>
+          <w:bCs/>
+          <w:color w:val="000000"/>
+        </w:rPr>
+        <w:t xml:space="preserve"> </w:t>
+      </w:r>
+      <w:r>
+        <w:rPr>
+          <w:color w:val="000000"/>
+        </w:rPr>
+        <w:t>System demonstrates an experimental integration of conventional CPU scheduling with machine learning and reinforcement learning. The application provides a browser interface for FCFS, SJF, and Round Robin scheduling and a separate AI workflow in which a Random Forest model estimates burst time and a PPO agent interacts with a custom scheduling environment.</w:t>
+      </w:r>
+    </w:p>
+    <w:p>
+      <w:r>
+        <w:rPr>
+          <w:color w:val="000000"/>
+        </w:rPr>
+        <w:t xml:space="preserve">The revised architecture clarifies that conventional scheduling calculations are performed on the client side, while the AI workflow is handled by Flask. The revised report also distinguishes machine learning and reinforcement learning from LLM-based systems, replaces unsupported claims of optimality with implementation-focused descriptions, and records the observed CPU-utilization </w:t>
+      </w:r>
+      <w:proofErr w:type="spellStart"/>
+      <w:r>
+        <w:rPr>
+          <w:color w:val="000000"/>
+        </w:rPr>
+        <w:t>NaN</w:t>
+      </w:r>
+      <w:proofErr w:type="spellEnd"/>
+      <w:r>
+        <w:rPr>
+          <w:color w:val="000000"/>
+        </w:rPr>
+        <w:t xml:space="preserve"> issue in the supplied screenshot.</w:t>
+      </w:r>
+    </w:p>
+    <w:p>
+      <w:r>
+        <w:rPr>
+          <w:color w:val="000000"/>
+        </w:rPr>
+        <w:t>The project provides a useful academic platform for exploring AI-assisted scheduling. To establish stronger performance conclusions, future work should include independent model validation, repeatable benchmark workloads, corrected metric calculations, automated tests, and broader workload evaluation.</w:t>
+      </w:r>
+    </w:p>
+    <w:p>
+      <w:pPr>
+        <w:pStyle w:val="Heading1"/>
       </w:pPr>
       <w:r>
         <w:rPr>
           <w:rFonts w:ascii="Times New Roman" w:eastAsia="Times New Roman" w:hAnsi="Times New Roman"/>
           <w:sz w:val="24"/>
         </w:rPr>
-        <w:t>16.3 Deployment Scope</w:t>
-      </w:r>
-    </w:p>
-    <w:p>
-      <w:r>
-        <w:rPr>
-          <w:color w:val="000000"/>
-        </w:rPr>
-        <w:t>The current architecture is suitable for local demonstration and experimentation. Production deployment would require hardened configuration, input validation, monitoring, controlled model loading, and appropriate web-server deployment practices.</w:t>
-      </w:r>
-    </w:p>
-    <w:p>
-      <w:pPr>
-        <w:pStyle w:val="Heading1"/>
-      </w:pPr>
-      <w:r>
-        <w:rPr>
-          <w:rFonts w:ascii="Times New Roman" w:eastAsia="Times New Roman" w:hAnsi="Times New Roman"/>
-          <w:sz w:val="24"/>
-        </w:rPr>
-        <w:t>17. LIMITATIONS</w:t>
+        <w:t>REFERENCES</w:t>
       </w:r>
     </w:p>
     <w:p>
@@ -7077,7 +7940,7 @@
         <w:rPr>
           <w:color w:val="000000"/>
         </w:rPr>
-        <w:t>The project is a CPU-scheduling simulation rather than a kernel-level operating-system scheduler.</w:t>
+        <w:t>Python Flask documentation.</w:t>
       </w:r>
     </w:p>
     <w:p>
@@ -7095,7 +7958,43 @@
         <w:rPr>
           <w:color w:val="000000"/>
         </w:rPr>
-        <w:t>The basic schedulers execute client-side while the AI scheduler uses the Flask backend, so the two paths are architecturally different.</w:t>
+        <w:t>scikit-learn documentation for Random</w:t>
+      </w:r>
+      <w:r>
+        <w:rPr>
+          <w:color w:val="000000"/>
+        </w:rPr>
+        <w:t xml:space="preserve"> </w:t>
+      </w:r>
+      <w:r>
+        <w:rPr>
+          <w:color w:val="000000"/>
+        </w:rPr>
+        <w:t>Forest</w:t>
+      </w:r>
+      <w:r>
+        <w:rPr>
+          <w:color w:val="000000"/>
+        </w:rPr>
+        <w:t xml:space="preserve"> </w:t>
+      </w:r>
+      <w:r>
+        <w:rPr>
+          <w:color w:val="000000"/>
+        </w:rPr>
+        <w:t>Regressor and Standard</w:t>
+      </w:r>
+      <w:r>
+        <w:rPr>
+          <w:color w:val="000000"/>
+        </w:rPr>
+        <w:t xml:space="preserve"> </w:t>
+      </w:r>
+      <w:r>
+        <w:rPr>
+          <w:color w:val="000000"/>
+        </w:rPr>
+        <w:t>Scaler.</w:t>
       </w:r>
     </w:p>
     <w:p>
@@ -7113,7 +8012,7 @@
         <w:rPr>
           <w:color w:val="000000"/>
         </w:rPr>
-        <w:t>The ML model depends on the available dataset and therefore requires independent validation before claims of generalization.</w:t>
+        <w:t>Stable-Baselines3 documentation for PPO.</w:t>
       </w:r>
     </w:p>
     <w:p>
@@ -7131,7 +8030,7 @@
         <w:rPr>
           <w:color w:val="000000"/>
         </w:rPr>
-        <w:t>The current storage approach does not provide persistent experiment history.</w:t>
+        <w:t>Gym/Gym-compatible reinforcement-learning environment documentation.</w:t>
       </w:r>
     </w:p>
     <w:p>
@@ -7149,360 +8048,11 @@
         <w:rPr>
           <w:color w:val="000000"/>
         </w:rPr>
-        <w:t>The displayed AI screenshot contains a NaN CPU-utilization result, indicating an edge case that requires correction.</w:t>
-      </w:r>
-    </w:p>
-    <w:p>
-      <w:pPr>
-        <w:ind w:left="360" w:hanging="259"/>
-      </w:pPr>
-      <w:r>
-        <w:rPr>
-          <w:b/>
-          <w:color w:val="000000"/>
-        </w:rPr>
-        <w:t xml:space="preserve">• </w:t>
-      </w:r>
-      <w:r>
-        <w:rPr>
-          <w:color w:val="000000"/>
-        </w:rPr>
-        <w:t>Arrival-time and workload realism should be evaluated further before treating the RL results as representative of real operating-system workloads.</w:t>
-      </w:r>
-    </w:p>
-    <w:p>
-      <w:pPr>
-        <w:ind w:left="360" w:hanging="259"/>
-      </w:pPr>
-      <w:r>
-        <w:rPr>
-          <w:b/>
-          <w:color w:val="000000"/>
-        </w:rPr>
-        <w:t xml:space="preserve">• </w:t>
-      </w:r>
-      <w:r>
-        <w:rPr>
-          <w:color w:val="000000"/>
-        </w:rPr>
-        <w:t>Performance comparisons should be based on repeated controlled experiments rather than a single screenshot.</w:t>
-      </w:r>
-    </w:p>
-    <w:p>
-      <w:pPr>
-        <w:pStyle w:val="Heading1"/>
-      </w:pPr>
-      <w:r>
-        <w:rPr>
-          <w:rFonts w:ascii="Times New Roman" w:eastAsia="Times New Roman" w:hAnsi="Times New Roman"/>
-          <w:sz w:val="24"/>
-        </w:rPr>
-        <w:t>18. FUTURE ENHANCEMENTS</w:t>
-      </w:r>
-    </w:p>
-    <w:p>
-      <w:pPr>
-        <w:ind w:left="403" w:hanging="288"/>
-      </w:pPr>
-      <w:r>
-        <w:rPr>
-          <w:b/>
-          <w:color w:val="000000"/>
-        </w:rPr>
-        <w:t xml:space="preserve">1. </w:t>
-      </w:r>
-      <w:r>
-        <w:rPr>
-          <w:color w:val="000000"/>
-        </w:rPr>
-        <w:t>Add persistent experiment storage using SQLite or PostgreSQL.</w:t>
-      </w:r>
-    </w:p>
-    <w:p>
-      <w:pPr>
-        <w:ind w:left="403" w:hanging="288"/>
-      </w:pPr>
-      <w:r>
-        <w:rPr>
-          <w:b/>
-          <w:color w:val="000000"/>
-        </w:rPr>
-        <w:t xml:space="preserve">2. </w:t>
-      </w:r>
-      <w:r>
-        <w:rPr>
-          <w:color w:val="000000"/>
-        </w:rPr>
-        <w:t>Improve validation for arrival times, feature ranges, and process counts.</w:t>
-      </w:r>
-    </w:p>
-    <w:p>
-      <w:pPr>
-        <w:ind w:left="403" w:hanging="288"/>
-      </w:pPr>
-      <w:r>
-        <w:rPr>
-          <w:b/>
-          <w:color w:val="000000"/>
-        </w:rPr>
-        <w:t xml:space="preserve">3. </w:t>
-      </w:r>
-      <w:r>
-        <w:rPr>
-          <w:color w:val="000000"/>
-        </w:rPr>
-        <w:t>Investigate and correct the CPU-utilization NaN edge case.</w:t>
-      </w:r>
-    </w:p>
-    <w:p>
-      <w:pPr>
-        <w:ind w:left="403" w:hanging="288"/>
-      </w:pPr>
-      <w:r>
-        <w:rPr>
-          <w:b/>
-          <w:color w:val="000000"/>
-        </w:rPr>
-        <w:t xml:space="preserve">4. </w:t>
-      </w:r>
-      <w:r>
-        <w:rPr>
-          <w:color w:val="000000"/>
-        </w:rPr>
-        <w:t>Add repeatable benchmark workloads and confidence/variance reporting.</w:t>
-      </w:r>
-    </w:p>
-    <w:p>
-      <w:pPr>
-        <w:ind w:left="403" w:hanging="288"/>
-      </w:pPr>
-      <w:r>
-        <w:rPr>
-          <w:b/>
-          <w:color w:val="000000"/>
-        </w:rPr>
-        <w:t xml:space="preserve">5. </w:t>
-      </w:r>
-      <w:r>
-        <w:rPr>
-          <w:color w:val="000000"/>
-        </w:rPr>
-        <w:t>Evaluate the ML model using independent validation/test traces.</w:t>
-      </w:r>
-    </w:p>
-    <w:p>
-      <w:pPr>
-        <w:ind w:left="403" w:hanging="288"/>
-      </w:pPr>
-      <w:r>
-        <w:rPr>
-          <w:b/>
-          <w:color w:val="000000"/>
-        </w:rPr>
-        <w:t xml:space="preserve">6. </w:t>
-      </w:r>
-      <w:r>
-        <w:rPr>
-          <w:color w:val="000000"/>
-        </w:rPr>
-        <w:t>Train and evaluate the RL scheduler with broader workload distributions and real process traces where appropriate.</w:t>
-      </w:r>
-    </w:p>
-    <w:p>
-      <w:pPr>
-        <w:ind w:left="403" w:hanging="288"/>
-      </w:pPr>
-      <w:r>
-        <w:rPr>
-          <w:b/>
-          <w:color w:val="000000"/>
-        </w:rPr>
-        <w:t xml:space="preserve">7. </w:t>
-      </w:r>
-      <w:r>
-        <w:rPr>
-          <w:color w:val="000000"/>
-        </w:rPr>
-        <w:t>Extend the simulator to multi-core CPU scheduling.</w:t>
-      </w:r>
-    </w:p>
-    <w:p>
-      <w:pPr>
-        <w:ind w:left="403" w:hanging="288"/>
-      </w:pPr>
-      <w:r>
-        <w:rPr>
-          <w:b/>
-          <w:color w:val="000000"/>
-        </w:rPr>
-        <w:t xml:space="preserve">8. </w:t>
-      </w:r>
-      <w:r>
-        <w:rPr>
-          <w:color w:val="000000"/>
-        </w:rPr>
-        <w:t>Add automated unit and integration tests.</w:t>
-      </w:r>
-    </w:p>
-    <w:p>
-      <w:pPr>
-        <w:ind w:left="403" w:hanging="288"/>
-      </w:pPr>
-      <w:r>
-        <w:rPr>
-          <w:b/>
-          <w:color w:val="000000"/>
-        </w:rPr>
-        <w:t xml:space="preserve">9. </w:t>
-      </w:r>
-      <w:r>
-        <w:rPr>
-          <w:color w:val="000000"/>
-        </w:rPr>
-        <w:t>Improve production deployment and security boundaries.</w:t>
-      </w:r>
-    </w:p>
-    <w:p>
-      <w:pPr>
-        <w:pStyle w:val="Heading1"/>
-      </w:pPr>
-      <w:r>
-        <w:rPr>
-          <w:rFonts w:ascii="Times New Roman" w:eastAsia="Times New Roman" w:hAnsi="Times New Roman"/>
-          <w:sz w:val="24"/>
-        </w:rPr>
-        <w:lastRenderedPageBreak/>
-        <w:t>19. CONCLUSION</w:t>
-      </w:r>
-    </w:p>
-    <w:p>
-      <w:r>
-        <w:rPr>
-          <w:color w:val="000000"/>
-        </w:rPr>
-        <w:t>The AI-Driven Process Management System demonstrates an experimental integration of conventional CPU scheduling with machine learning and reinforcement learning. The application provides a browser interface for FCFS, SJF, and Round Robin scheduling and a separate AI workflow in which a Random Forest model estimates burst time and a PPO agent interacts with a custom scheduling environment.</w:t>
-      </w:r>
-    </w:p>
-    <w:p>
-      <w:r>
-        <w:rPr>
-          <w:color w:val="000000"/>
-        </w:rPr>
-        <w:t>The revised architecture clarifies that conventional scheduling calculations are performed on the client side, while the AI workflow is handled by Flask. The revised report also distinguishes machine learning and reinforcement learning from LLM-based systems, replaces unsupported claims of optimality with implementation-focused descriptions, and records the observed CPU-utilization NaN issue in the supplied screenshot.</w:t>
-      </w:r>
-    </w:p>
-    <w:p>
-      <w:r>
-        <w:rPr>
-          <w:color w:val="000000"/>
-        </w:rPr>
-        <w:t>The project provides a useful academic platform for exploring AI-assisted scheduling. To establish stronger performance conclusions, future work should include independent model validation, repeatable benchmark workloads, corrected metric calculations, automated tests, and broader workload evaluation.</w:t>
-      </w:r>
-    </w:p>
-    <w:p>
-      <w:pPr>
-        <w:pStyle w:val="Heading1"/>
-      </w:pPr>
-      <w:r>
-        <w:rPr>
-          <w:rFonts w:ascii="Times New Roman" w:eastAsia="Times New Roman" w:hAnsi="Times New Roman"/>
-          <w:sz w:val="24"/>
-        </w:rPr>
-        <w:t>REFERENCES</w:t>
-      </w:r>
-    </w:p>
-    <w:p>
-      <w:pPr>
-        <w:ind w:left="360" w:hanging="259"/>
-      </w:pPr>
-      <w:r>
-        <w:rPr>
-          <w:b/>
-          <w:color w:val="000000"/>
-        </w:rPr>
-        <w:t xml:space="preserve">• </w:t>
-      </w:r>
-      <w:r>
-        <w:rPr>
-          <w:color w:val="000000"/>
-        </w:rPr>
-        <w:t>Python Flask documentation.</w:t>
-      </w:r>
-    </w:p>
-    <w:p>
-      <w:pPr>
-        <w:ind w:left="360" w:hanging="259"/>
-      </w:pPr>
-      <w:r>
-        <w:rPr>
-          <w:b/>
-          <w:color w:val="000000"/>
-        </w:rPr>
-        <w:t xml:space="preserve">• </w:t>
-      </w:r>
-      <w:r>
-        <w:rPr>
-          <w:color w:val="000000"/>
-        </w:rPr>
-        <w:t>scikit-learn documentation for RandomForestRegressor and StandardScaler.</w:t>
-      </w:r>
-    </w:p>
-    <w:p>
-      <w:pPr>
-        <w:ind w:left="360" w:hanging="259"/>
-      </w:pPr>
-      <w:r>
-        <w:rPr>
-          <w:b/>
-          <w:color w:val="000000"/>
-        </w:rPr>
-        <w:t xml:space="preserve">• </w:t>
-      </w:r>
-      <w:r>
-        <w:rPr>
-          <w:color w:val="000000"/>
-        </w:rPr>
-        <w:t>Stable-Baselines3 documentation for PPO.</w:t>
-      </w:r>
-    </w:p>
-    <w:p>
-      <w:pPr>
-        <w:ind w:left="360" w:hanging="259"/>
-      </w:pPr>
-      <w:r>
-        <w:rPr>
-          <w:b/>
-          <w:color w:val="000000"/>
-        </w:rPr>
-        <w:t xml:space="preserve">• </w:t>
-      </w:r>
-      <w:r>
-        <w:rPr>
-          <w:color w:val="000000"/>
-        </w:rPr>
-        <w:t>Gym/Gym-compatible reinforcement-learning environment documentation.</w:t>
-      </w:r>
-    </w:p>
-    <w:p>
-      <w:pPr>
-        <w:ind w:left="360" w:hanging="259"/>
-      </w:pPr>
-      <w:r>
-        <w:rPr>
-          <w:b/>
-          <w:color w:val="000000"/>
-        </w:rPr>
-        <w:t xml:space="preserve">• </w:t>
-      </w:r>
-      <w:r>
-        <w:rPr>
-          <w:color w:val="000000"/>
-        </w:rPr>
         <w:t>Bootstrap 5 documentation.</w:t>
       </w:r>
     </w:p>
     <w:sectPr>
-      <w:footerReference w:type="default" r:id="rId16"/>
+      <w:footerReference w:type="default" r:id="rId18"/>
       <w:pgSz w:w="12240" w:h="15840"/>
       <w:pgMar w:top="1152" w:right="758" w:bottom="709" w:left="851" w:header="720" w:footer="720" w:gutter="0"/>
       <w:pgBorders w:offsetFrom="page">
@@ -7548,12 +8098,10 @@
   <w:p>
     <w:pPr>
       <w:pStyle w:val="Footer"/>
+      <w:jc w:val="center"/>
     </w:pPr>
     <w:r>
-      <w:tab/>
-    </w:r>
-    <w:r>
-      <w:t xml:space="preserve"> Page </w:t>
+      <w:t xml:space="preserve">Page </w:t>
     </w:r>
     <w:r>
       <w:rPr>

</xml_diff>